<commit_message>
Redact student number and AWS account ID from report deliverables
Replaced the student number (CCA5008) and AWS account ID
(477013660512) with REDACTED across both PDFs, both docx copies,
all three pptx copies, the two generator scripts, and the two
week checklist files that still referenced the account number.
</commit_message>
<xml_diff>
--- a/SOCWatch-Evidence/SOCWatch-Evidence/report/SOCWatch-Installation-and-Project-Guide.docx
+++ b/SOCWatch-Evidence/SOCWatch-Evidence/report/SOCWatch-Installation-and-Project-Guide.docx
@@ -76,7 +76,7 @@
           <w:sz w:val="22"/>
           <w:szCs w:val="22"/>
         </w:rPr>
-        <w:t xml:space="preserve">Student Number: CCA5008</w:t>
+        <w:t xml:space="preserve">Student Number: REDACTED</w:t>
       </w:r>
     </w:p>
     <w:p>
@@ -102,7 +102,7 @@
           <w:sz w:val="20"/>
           <w:szCs w:val="20"/>
         </w:rPr>
-        <w:t xml:space="preserve">AWS Account: 477013660512  |  Region: ap-south-1 (Mumbai)</w:t>
+        <w:t xml:space="preserve">AWS Account: REDACTED  |  Region: ap-south-1 (Mumbai)</w:t>
       </w:r>
     </w:p>
     <w:p>
@@ -2129,7 +2129,7 @@
         <w:spacing w:after="80"/>
       </w:pPr>
       <w:r>
-        <w:t xml:space="preserve">All AWS account configuration, infrastructure diagnosis and repair, Wazuh installation, agent enrolment, detection-use-case validation, dashboard evidence capture, and documentation completed by Nishen Madawa Abedeera (Student Number: CCA5008).</w:t>
+        <w:t xml:space="preserve">All AWS account configuration, infrastructure diagnosis and repair, Wazuh installation, agent enrolment, detection-use-case validation, dashboard evidence capture, and documentation completed by Nishen Madawa Abedeera (Student Number: REDACTED).</w:t>
       </w:r>
     </w:p>
     <w:p>
@@ -2303,7 +2303,7 @@
         <w:spacing w:after="80"/>
       </w:pPr>
       <w:r>
-        <w:t xml:space="preserve">An AWS account with billing enabled (account 477013660512).</w:t>
+        <w:t xml:space="preserve">An AWS account with billing enabled (account REDACTED).</w:t>
       </w:r>
     </w:p>
     <w:p>
@@ -9371,7 +9371,7 @@
         <w:spacing w:after="160"/>
       </w:pPr>
       <w:r>
-        <w:t xml:space="preserve">This project is completed individually. All AWS account configuration (IAM baseline, budget, security group design), infrastructure-as-code (Terraform), Wazuh installation, agent enrolment, detection use-case testing and reporting is designed, executed and defensible by the author, Nishen Madawa Abedeera (Student Number: CCA5008).</w:t>
+        <w:t xml:space="preserve">This project is completed individually. All AWS account configuration (IAM baseline, budget, security group design), infrastructure-as-code (Terraform), Wazuh installation, agent enrolment, detection use-case testing and reporting is designed, executed and defensible by the author, Nishen Madawa Abedeera (Student Number: REDACTED).</w:t>
       </w:r>
     </w:p>
     <w:sectPr>

</xml_diff>